<commit_message>
add storeroom description to the document
</commit_message>
<xml_diff>
--- a/doc/سامانه شاهین.docx
+++ b/doc/سامانه شاهین.docx
@@ -8174,8 +8174,6 @@
           </wp:inline>
         </w:drawing>
       </w:r>
-      <w:bookmarkStart w:id="17" w:name="_GoBack"/>
-      <w:bookmarkEnd w:id="17"/>
     </w:p>
     <w:p>
       <w:pPr>
@@ -8201,8 +8199,8 @@
           <w:lang w:bidi="fa-IR"/>
         </w:rPr>
       </w:pPr>
-      <w:bookmarkStart w:id="18" w:name="_انبارداری_:"/>
-      <w:bookmarkEnd w:id="18"/>
+      <w:bookmarkStart w:id="17" w:name="_انبارداری_:"/>
+      <w:bookmarkEnd w:id="17"/>
       <w:r>
         <w:rPr>
           <w:rFonts w:cs="B Nazanin" w:hint="cs"/>
@@ -8217,8 +8215,90 @@
     </w:p>
     <w:p>
       <w:pPr>
-        <w:pStyle w:val="Heading1"/>
-        <w:bidi/>
+        <w:bidi/>
+        <w:rPr>
+          <w:rtl/>
+          <w:lang w:bidi="fa-IR"/>
+        </w:rPr>
+      </w:pPr>
+    </w:p>
+    <w:p>
+      <w:pPr>
+        <w:bidi/>
+        <w:jc w:val="both"/>
+        <w:rPr>
+          <w:rFonts w:cs="B Nazanin" w:hint="cs"/>
+          <w:sz w:val="32"/>
+          <w:szCs w:val="32"/>
+          <w:rtl/>
+          <w:lang w:bidi="fa-IR"/>
+        </w:rPr>
+      </w:pPr>
+      <w:r>
+        <w:rPr>
+          <w:rFonts w:cs="B Nazanin" w:hint="cs"/>
+          <w:sz w:val="32"/>
+          <w:szCs w:val="32"/>
+          <w:rtl/>
+          <w:lang w:bidi="fa-IR"/>
+        </w:rPr>
+        <w:t>از دیگر قابلیت های سامانه شاهین می توان به سیستم جامع ا</w:t>
+      </w:r>
+      <w:r>
+        <w:rPr>
+          <w:rFonts w:cs="B Nazanin" w:hint="cs"/>
+          <w:sz w:val="32"/>
+          <w:szCs w:val="32"/>
+          <w:rtl/>
+          <w:lang w:bidi="fa-IR"/>
+        </w:rPr>
+        <w:t>نبارداری شاهین</w:t>
+      </w:r>
+      <w:r>
+        <w:rPr>
+          <w:rFonts w:cs="B Nazanin" w:hint="cs"/>
+          <w:sz w:val="32"/>
+          <w:szCs w:val="32"/>
+          <w:rtl/>
+          <w:lang w:bidi="fa-IR"/>
+        </w:rPr>
+        <w:t xml:space="preserve"> اشاره کرد. این سامان</w:t>
+      </w:r>
+      <w:r>
+        <w:rPr>
+          <w:rFonts w:cs="B Nazanin" w:hint="cs"/>
+          <w:sz w:val="32"/>
+          <w:szCs w:val="32"/>
+          <w:rtl/>
+          <w:lang w:bidi="fa-IR"/>
+        </w:rPr>
+        <w:t>ه امکان ورود و</w:t>
+      </w:r>
+      <w:r>
+        <w:rPr>
+          <w:rFonts w:cs="B Nazanin" w:hint="cs"/>
+          <w:sz w:val="32"/>
+          <w:szCs w:val="32"/>
+          <w:rtl/>
+          <w:lang w:bidi="fa-IR"/>
+        </w:rPr>
+        <w:t xml:space="preserve"> خروج کالا و گزارش گیری از موجودی را فراهم کرده است . سامانه انبارداری شاهین از ویژگی هایی برخوردار است که باعث برتری آن نسبت به سایر نرم افزارهای انبارداری شده است</w:t>
+      </w:r>
+      <w:r>
+        <w:rPr>
+          <w:rFonts w:cs="B Nazanin" w:hint="cs"/>
+          <w:sz w:val="32"/>
+          <w:szCs w:val="32"/>
+          <w:rtl/>
+          <w:lang w:bidi="fa-IR"/>
+        </w:rPr>
+        <w:t>.</w:t>
+      </w:r>
+    </w:p>
+    <w:p>
+      <w:pPr>
+        <w:bidi/>
+        <w:jc w:val="both"/>
         <w:rPr>
           <w:rFonts w:cs="B Nazanin"/>
           <w:sz w:val="36"/>
@@ -8227,8 +8307,6 @@
           <w:lang w:bidi="fa-IR"/>
         </w:rPr>
       </w:pPr>
-      <w:bookmarkStart w:id="19" w:name="_سیستم_کد_تخفیف"/>
-      <w:bookmarkEnd w:id="19"/>
       <w:r>
         <w:rPr>
           <w:rFonts w:cs="B Nazanin" w:hint="cs"/>
@@ -8237,60 +8315,628 @@
           <w:rtl/>
           <w:lang w:bidi="fa-IR"/>
         </w:rPr>
-        <w:t xml:space="preserve">سیستم کد تخفیف : </w:t>
+        <w:t>قابلیت های سامانه :</w:t>
+      </w:r>
+    </w:p>
+    <w:p>
+      <w:pPr>
+        <w:pStyle w:val="ListParagraph"/>
+        <w:numPr>
+          <w:ilvl w:val="0"/>
+          <w:numId w:val="33"/>
+        </w:numPr>
+        <w:bidi/>
+        <w:jc w:val="both"/>
+        <w:rPr>
+          <w:rFonts w:cs="B Nazanin" w:hint="cs"/>
+          <w:sz w:val="32"/>
+          <w:szCs w:val="32"/>
+          <w:lang w:bidi="fa-IR"/>
+        </w:rPr>
+      </w:pPr>
+      <w:r>
+        <w:rPr>
+          <w:rFonts w:cs="B Nazanin" w:hint="cs"/>
+          <w:sz w:val="32"/>
+          <w:szCs w:val="32"/>
+          <w:rtl/>
+          <w:lang w:bidi="fa-IR"/>
+        </w:rPr>
+        <w:t>درج کالا در انبار با تمام جزئیات کالا</w:t>
+      </w:r>
+    </w:p>
+    <w:p>
+      <w:pPr>
+        <w:pStyle w:val="ListParagraph"/>
+        <w:numPr>
+          <w:ilvl w:val="0"/>
+          <w:numId w:val="33"/>
+        </w:numPr>
+        <w:bidi/>
+        <w:jc w:val="both"/>
+        <w:rPr>
+          <w:rFonts w:cs="B Nazanin" w:hint="cs"/>
+          <w:sz w:val="32"/>
+          <w:szCs w:val="32"/>
+          <w:lang w:bidi="fa-IR"/>
+        </w:rPr>
+      </w:pPr>
+      <w:r>
+        <w:rPr>
+          <w:rFonts w:cs="B Nazanin" w:hint="cs"/>
+          <w:sz w:val="32"/>
+          <w:szCs w:val="32"/>
+          <w:rtl/>
+          <w:lang w:bidi="fa-IR"/>
+        </w:rPr>
+        <w:t>درخواست خروج کالا از انبار</w:t>
+      </w:r>
+    </w:p>
+    <w:p>
+      <w:pPr>
+        <w:pStyle w:val="ListParagraph"/>
+        <w:numPr>
+          <w:ilvl w:val="0"/>
+          <w:numId w:val="33"/>
+        </w:numPr>
+        <w:bidi/>
+        <w:jc w:val="both"/>
+        <w:rPr>
+          <w:rFonts w:cs="B Nazanin" w:hint="cs"/>
+          <w:sz w:val="32"/>
+          <w:szCs w:val="32"/>
+          <w:lang w:bidi="fa-IR"/>
+        </w:rPr>
+      </w:pPr>
+      <w:r>
+        <w:rPr>
+          <w:rFonts w:cs="B Nazanin" w:hint="cs"/>
+          <w:sz w:val="32"/>
+          <w:szCs w:val="32"/>
+          <w:rtl/>
+          <w:lang w:bidi="fa-IR"/>
+        </w:rPr>
+        <w:t xml:space="preserve">تایید خروج </w:t>
+      </w:r>
+    </w:p>
+    <w:p>
+      <w:pPr>
+        <w:pStyle w:val="ListParagraph"/>
+        <w:numPr>
+          <w:ilvl w:val="0"/>
+          <w:numId w:val="33"/>
+        </w:numPr>
+        <w:bidi/>
+        <w:jc w:val="both"/>
+        <w:rPr>
+          <w:rFonts w:cs="B Nazanin" w:hint="cs"/>
+          <w:sz w:val="32"/>
+          <w:szCs w:val="32"/>
+          <w:lang w:bidi="fa-IR"/>
+        </w:rPr>
+      </w:pPr>
+      <w:r>
+        <w:rPr>
+          <w:rFonts w:cs="B Nazanin" w:hint="cs"/>
+          <w:sz w:val="32"/>
+          <w:szCs w:val="32"/>
+          <w:rtl/>
+          <w:lang w:bidi="fa-IR"/>
+        </w:rPr>
+        <w:t>گزارش گیری کلی از ورود و خروج کالا به همراه نام واردکننده و خارج کننده کالا</w:t>
+      </w:r>
+    </w:p>
+    <w:p>
+      <w:pPr>
+        <w:pStyle w:val="ListParagraph"/>
+        <w:numPr>
+          <w:ilvl w:val="0"/>
+          <w:numId w:val="33"/>
+        </w:numPr>
+        <w:bidi/>
+        <w:jc w:val="both"/>
+        <w:rPr>
+          <w:rFonts w:cs="B Nazanin" w:hint="cs"/>
+          <w:sz w:val="32"/>
+          <w:szCs w:val="32"/>
+          <w:lang w:bidi="fa-IR"/>
+        </w:rPr>
+      </w:pPr>
+      <w:r>
+        <w:rPr>
+          <w:rFonts w:cs="B Nazanin" w:hint="cs"/>
+          <w:sz w:val="32"/>
+          <w:szCs w:val="32"/>
+          <w:rtl/>
+          <w:lang w:bidi="fa-IR"/>
+        </w:rPr>
+        <w:t>گزارش گیری از کالاهای درحال انقضا</w:t>
+      </w:r>
+    </w:p>
+    <w:p>
+      <w:pPr>
+        <w:pStyle w:val="ListParagraph"/>
+        <w:numPr>
+          <w:ilvl w:val="0"/>
+          <w:numId w:val="33"/>
+        </w:numPr>
+        <w:bidi/>
+        <w:jc w:val="both"/>
+        <w:rPr>
+          <w:rFonts w:cs="B Nazanin"/>
+          <w:sz w:val="32"/>
+          <w:szCs w:val="32"/>
+          <w:lang w:bidi="fa-IR"/>
+        </w:rPr>
+      </w:pPr>
+      <w:r>
+        <w:rPr>
+          <w:rFonts w:cs="B Nazanin" w:hint="cs"/>
+          <w:sz w:val="32"/>
+          <w:szCs w:val="32"/>
+          <w:rtl/>
+          <w:lang w:bidi="fa-IR"/>
+        </w:rPr>
+        <w:t>امکان ثبت انبار زیرمجموعه برای انبار کل و مدیریت انبار زیرمجموعه توسط انباردارکل</w:t>
+      </w:r>
+    </w:p>
+    <w:p>
+      <w:pPr>
+        <w:pStyle w:val="ListParagraph"/>
+        <w:numPr>
+          <w:ilvl w:val="0"/>
+          <w:numId w:val="33"/>
+        </w:numPr>
+        <w:bidi/>
+        <w:jc w:val="both"/>
+        <w:rPr>
+          <w:rFonts w:cs="B Nazanin" w:hint="cs"/>
+          <w:sz w:val="32"/>
+          <w:szCs w:val="32"/>
+          <w:lang w:bidi="fa-IR"/>
+        </w:rPr>
+      </w:pPr>
+      <w:r>
+        <w:rPr>
+          <w:rFonts w:cs="B Nazanin" w:hint="cs"/>
+          <w:sz w:val="32"/>
+          <w:szCs w:val="32"/>
+          <w:rtl/>
+          <w:lang w:bidi="fa-IR"/>
+        </w:rPr>
+        <w:t>گزارش گیری از کالاهای درحال اتمام</w:t>
+      </w:r>
+    </w:p>
+    <w:p>
+      <w:pPr>
+        <w:pStyle w:val="ListParagraph"/>
+        <w:numPr>
+          <w:ilvl w:val="0"/>
+          <w:numId w:val="33"/>
+        </w:numPr>
+        <w:bidi/>
+        <w:jc w:val="both"/>
+        <w:rPr>
+          <w:rFonts w:cs="B Nazanin"/>
+          <w:sz w:val="32"/>
+          <w:szCs w:val="32"/>
+          <w:lang w:bidi="fa-IR"/>
+        </w:rPr>
+      </w:pPr>
+      <w:r>
+        <w:rPr>
+          <w:rFonts w:cs="B Nazanin" w:hint="cs"/>
+          <w:sz w:val="32"/>
+          <w:szCs w:val="32"/>
+          <w:rtl/>
+          <w:lang w:bidi="fa-IR"/>
+        </w:rPr>
+        <w:t>امکان ثبت مدت زمان مورد نیاز برای خرید مجدد کالا</w:t>
+      </w:r>
+    </w:p>
+    <w:p>
+      <w:pPr>
+        <w:pStyle w:val="ListParagraph"/>
+        <w:numPr>
+          <w:ilvl w:val="0"/>
+          <w:numId w:val="33"/>
+        </w:numPr>
+        <w:bidi/>
+        <w:jc w:val="both"/>
+        <w:rPr>
+          <w:rFonts w:cs="B Nazanin" w:hint="cs"/>
+          <w:sz w:val="32"/>
+          <w:szCs w:val="32"/>
+          <w:rtl/>
+          <w:lang w:bidi="fa-IR"/>
+        </w:rPr>
+      </w:pPr>
+      <w:r>
+        <w:rPr>
+          <w:rFonts w:cs="B Nazanin" w:hint="cs"/>
+          <w:sz w:val="32"/>
+          <w:szCs w:val="32"/>
+          <w:rtl/>
+          <w:lang w:bidi="fa-IR"/>
+        </w:rPr>
+        <w:t xml:space="preserve">امکان ثبت و مشاهده کالا و مواد اولیه </w:t>
+      </w:r>
+      <w:r>
+        <w:rPr>
+          <w:rFonts w:cs="B Nazanin" w:hint="cs"/>
+          <w:sz w:val="32"/>
+          <w:szCs w:val="32"/>
+          <w:rtl/>
+          <w:lang w:bidi="fa-IR"/>
+        </w:rPr>
+        <w:t xml:space="preserve">مصرفی </w:t>
+      </w:r>
+      <w:r>
+        <w:rPr>
+          <w:rFonts w:cs="B Nazanin" w:hint="cs"/>
+          <w:sz w:val="32"/>
+          <w:szCs w:val="32"/>
+          <w:rtl/>
+          <w:lang w:bidi="fa-IR"/>
+        </w:rPr>
+        <w:t>بصورت جدا از هم در هر انبار</w:t>
+      </w:r>
+    </w:p>
+    <w:p>
+      <w:pPr>
+        <w:pStyle w:val="ListParagraph"/>
+        <w:bidi/>
+        <w:jc w:val="both"/>
+        <w:rPr>
+          <w:rFonts w:cs="B Nazanin"/>
+          <w:sz w:val="32"/>
+          <w:szCs w:val="32"/>
+          <w:lang w:bidi="fa-IR"/>
+        </w:rPr>
+      </w:pPr>
+    </w:p>
+    <w:p>
+      <w:pPr>
+        <w:bidi/>
+        <w:jc w:val="both"/>
+        <w:rPr>
+          <w:rFonts w:cs="B Nazanin"/>
+          <w:sz w:val="32"/>
+          <w:szCs w:val="32"/>
+          <w:rtl/>
+          <w:lang w:bidi="fa-IR"/>
+        </w:rPr>
+      </w:pPr>
+      <w:r>
+        <w:rPr>
+          <w:rFonts w:cs="B Nazanin"/>
+          <w:noProof/>
+          <w:sz w:val="32"/>
+          <w:szCs w:val="32"/>
+          <w:rtl/>
+        </w:rPr>
+        <w:drawing>
+          <wp:inline distT="0" distB="0" distL="0" distR="0">
+            <wp:extent cx="5943600" cy="2611112"/>
+            <wp:effectExtent l="0" t="0" r="0" b="0"/>
+            <wp:docPr id="1" name="Picture 1" descr="C:\Users\user\Downloads\Screenshot (654) (1).jpg"/>
+            <wp:cNvGraphicFramePr>
+              <a:graphicFrameLocks xmlns:a="http://schemas.openxmlformats.org/drawingml/2006/main" noChangeAspect="1"/>
+            </wp:cNvGraphicFramePr>
+            <a:graphic xmlns:a="http://schemas.openxmlformats.org/drawingml/2006/main">
+              <a:graphicData uri="http://schemas.openxmlformats.org/drawingml/2006/picture">
+                <pic:pic xmlns:pic="http://schemas.openxmlformats.org/drawingml/2006/picture">
+                  <pic:nvPicPr>
+                    <pic:cNvPr id="0" name="Picture 1" descr="C:\Users\user\Downloads\Screenshot (654) (1).jpg"/>
+                    <pic:cNvPicPr>
+                      <a:picLocks noChangeAspect="1" noChangeArrowheads="1"/>
+                    </pic:cNvPicPr>
+                  </pic:nvPicPr>
+                  <pic:blipFill>
+                    <a:blip r:embed="rId29">
+                      <a:extLst>
+                        <a:ext uri="{28A0092B-C50C-407E-A947-70E740481C1C}">
+                          <a14:useLocalDpi xmlns:a14="http://schemas.microsoft.com/office/drawing/2010/main" val="0"/>
+                        </a:ext>
+                      </a:extLst>
+                    </a:blip>
+                    <a:srcRect/>
+                    <a:stretch>
+                      <a:fillRect/>
+                    </a:stretch>
+                  </pic:blipFill>
+                  <pic:spPr bwMode="auto">
+                    <a:xfrm>
+                      <a:off x="0" y="0"/>
+                      <a:ext cx="5943600" cy="2611112"/>
+                    </a:xfrm>
+                    <a:prstGeom prst="rect">
+                      <a:avLst/>
+                    </a:prstGeom>
+                    <a:noFill/>
+                    <a:ln>
+                      <a:noFill/>
+                    </a:ln>
+                  </pic:spPr>
+                </pic:pic>
+              </a:graphicData>
+            </a:graphic>
+          </wp:inline>
+        </w:drawing>
       </w:r>
     </w:p>
     <w:p>
       <w:pPr>
         <w:pStyle w:val="Heading1"/>
-        <w:bidi/>
-        <w:rPr>
-          <w:rFonts w:cs="B Nazanin"/>
+        <w:numPr>
+          <w:ilvl w:val="0"/>
+          <w:numId w:val="28"/>
+        </w:numPr>
+        <w:bidi/>
+        <w:rPr>
+          <w:rFonts w:cs="B Nazanin"/>
+          <w:color w:val="auto"/>
           <w:sz w:val="36"/>
           <w:szCs w:val="36"/>
           <w:rtl/>
           <w:lang w:bidi="fa-IR"/>
         </w:rPr>
       </w:pPr>
-      <w:bookmarkStart w:id="20" w:name="_سیستم_ثبت_کالا"/>
-      <w:bookmarkEnd w:id="20"/>
-      <w:r>
-        <w:rPr>
-          <w:rFonts w:cs="B Nazanin" w:hint="cs"/>
+      <w:bookmarkStart w:id="18" w:name="_سیستم_کد_تخفیف"/>
+      <w:bookmarkEnd w:id="18"/>
+      <w:r>
+        <w:rPr>
+          <w:rFonts w:cs="B Nazanin" w:hint="cs"/>
+          <w:color w:val="auto"/>
           <w:sz w:val="36"/>
           <w:szCs w:val="36"/>
           <w:rtl/>
           <w:lang w:bidi="fa-IR"/>
         </w:rPr>
-        <w:t>سیستم ثبت کالا :</w:t>
-      </w:r>
+        <w:lastRenderedPageBreak/>
+        <w:t>فهرست موجودی کالاها در انبار مورد نظر</w:t>
+      </w:r>
+    </w:p>
+    <w:p>
+      <w:pPr>
+        <w:bidi/>
+        <w:rPr>
+          <w:rtl/>
+          <w:lang w:bidi="fa-IR"/>
+        </w:rPr>
+      </w:pPr>
+    </w:p>
+    <w:p>
+      <w:pPr>
+        <w:bidi/>
+        <w:rPr>
+          <w:rFonts w:hint="cs"/>
+          <w:rtl/>
+          <w:lang w:bidi="fa-IR"/>
+        </w:rPr>
+      </w:pPr>
+      <w:r>
+        <w:rPr>
+          <w:rFonts w:cs="Arial"/>
+          <w:noProof/>
+          <w:rtl/>
+        </w:rPr>
+        <w:drawing>
+          <wp:inline distT="0" distB="0" distL="0" distR="0">
+            <wp:extent cx="5943600" cy="2883222"/>
+            <wp:effectExtent l="0" t="0" r="0" b="0"/>
+            <wp:docPr id="2" name="Picture 2" descr="C:\Users\user\Downloads\Screenshot (656).jpg"/>
+            <wp:cNvGraphicFramePr>
+              <a:graphicFrameLocks xmlns:a="http://schemas.openxmlformats.org/drawingml/2006/main" noChangeAspect="1"/>
+            </wp:cNvGraphicFramePr>
+            <a:graphic xmlns:a="http://schemas.openxmlformats.org/drawingml/2006/main">
+              <a:graphicData uri="http://schemas.openxmlformats.org/drawingml/2006/picture">
+                <pic:pic xmlns:pic="http://schemas.openxmlformats.org/drawingml/2006/picture">
+                  <pic:nvPicPr>
+                    <pic:cNvPr id="0" name="Picture 2" descr="C:\Users\user\Downloads\Screenshot (656).jpg"/>
+                    <pic:cNvPicPr>
+                      <a:picLocks noChangeAspect="1" noChangeArrowheads="1"/>
+                    </pic:cNvPicPr>
+                  </pic:nvPicPr>
+                  <pic:blipFill>
+                    <a:blip r:embed="rId30">
+                      <a:extLst>
+                        <a:ext uri="{28A0092B-C50C-407E-A947-70E740481C1C}">
+                          <a14:useLocalDpi xmlns:a14="http://schemas.microsoft.com/office/drawing/2010/main" val="0"/>
+                        </a:ext>
+                      </a:extLst>
+                    </a:blip>
+                    <a:srcRect/>
+                    <a:stretch>
+                      <a:fillRect/>
+                    </a:stretch>
+                  </pic:blipFill>
+                  <pic:spPr bwMode="auto">
+                    <a:xfrm>
+                      <a:off x="0" y="0"/>
+                      <a:ext cx="5943600" cy="2883222"/>
+                    </a:xfrm>
+                    <a:prstGeom prst="rect">
+                      <a:avLst/>
+                    </a:prstGeom>
+                    <a:noFill/>
+                    <a:ln>
+                      <a:noFill/>
+                    </a:ln>
+                  </pic:spPr>
+                </pic:pic>
+              </a:graphicData>
+            </a:graphic>
+          </wp:inline>
+        </w:drawing>
+      </w:r>
+    </w:p>
+    <w:p>
+      <w:pPr>
+        <w:bidi/>
+        <w:rPr>
+          <w:rtl/>
+          <w:lang w:bidi="fa-IR"/>
+        </w:rPr>
+      </w:pPr>
     </w:p>
     <w:p>
       <w:pPr>
         <w:pStyle w:val="Heading1"/>
-        <w:bidi/>
-        <w:rPr>
-          <w:rFonts w:cs="B Nazanin"/>
+        <w:numPr>
+          <w:ilvl w:val="0"/>
+          <w:numId w:val="28"/>
+        </w:numPr>
+        <w:bidi/>
+        <w:rPr>
+          <w:rFonts w:cs="B Nazanin"/>
+          <w:color w:val="auto"/>
           <w:sz w:val="36"/>
           <w:szCs w:val="36"/>
           <w:rtl/>
           <w:lang w:bidi="fa-IR"/>
         </w:rPr>
       </w:pPr>
-      <w:bookmarkStart w:id="21" w:name="_نتیجه_گیری_:"/>
-      <w:bookmarkStart w:id="22" w:name="_مشخصات_فنی_سامانه"/>
-      <w:bookmarkEnd w:id="21"/>
-      <w:bookmarkEnd w:id="22"/>
-      <w:r>
-        <w:rPr>
-          <w:rFonts w:cs="B Nazanin" w:hint="cs"/>
+      <w:r>
+        <w:rPr>
+          <w:rFonts w:cs="B Nazanin" w:hint="cs"/>
+          <w:color w:val="auto"/>
           <w:sz w:val="36"/>
           <w:szCs w:val="36"/>
           <w:rtl/>
           <w:lang w:bidi="fa-IR"/>
         </w:rPr>
+        <w:t>فهرست موجودی مواد اولیه</w:t>
+      </w:r>
+      <w:r>
+        <w:rPr>
+          <w:rFonts w:cs="B Nazanin" w:hint="cs"/>
+          <w:color w:val="auto"/>
+          <w:sz w:val="36"/>
+          <w:szCs w:val="36"/>
+          <w:rtl/>
+          <w:lang w:bidi="fa-IR"/>
+        </w:rPr>
+        <w:t xml:space="preserve"> در انبار مورد نظر</w:t>
+      </w:r>
+    </w:p>
+    <w:p>
+      <w:pPr>
+        <w:bidi/>
+        <w:rPr>
+          <w:rtl/>
+          <w:lang w:bidi="fa-IR"/>
+        </w:rPr>
+      </w:pPr>
+    </w:p>
+    <w:p>
+      <w:pPr>
+        <w:bidi/>
+        <w:rPr>
+          <w:rFonts w:cs="B Nazanin"/>
+          <w:sz w:val="36"/>
+          <w:szCs w:val="36"/>
+          <w:rtl/>
+          <w:lang w:bidi="fa-IR"/>
+        </w:rPr>
+      </w:pPr>
+      <w:r>
+        <w:rPr>
+          <w:rFonts w:cs="Arial"/>
+          <w:noProof/>
+          <w:rtl/>
+        </w:rPr>
+        <w:drawing>
+          <wp:inline distT="0" distB="0" distL="0" distR="0" wp14:anchorId="7772D098" wp14:editId="0AB94FEF">
+            <wp:extent cx="5943600" cy="2890048"/>
+            <wp:effectExtent l="0" t="0" r="0" b="5715"/>
+            <wp:docPr id="3" name="Picture 3" descr="C:\Users\user\Downloads\Screenshot (658).jpg"/>
+            <wp:cNvGraphicFramePr>
+              <a:graphicFrameLocks xmlns:a="http://schemas.openxmlformats.org/drawingml/2006/main" noChangeAspect="1"/>
+            </wp:cNvGraphicFramePr>
+            <a:graphic xmlns:a="http://schemas.openxmlformats.org/drawingml/2006/main">
+              <a:graphicData uri="http://schemas.openxmlformats.org/drawingml/2006/picture">
+                <pic:pic xmlns:pic="http://schemas.openxmlformats.org/drawingml/2006/picture">
+                  <pic:nvPicPr>
+                    <pic:cNvPr id="0" name="Picture 3" descr="C:\Users\user\Downloads\Screenshot (658).jpg"/>
+                    <pic:cNvPicPr>
+                      <a:picLocks noChangeAspect="1" noChangeArrowheads="1"/>
+                    </pic:cNvPicPr>
+                  </pic:nvPicPr>
+                  <pic:blipFill>
+                    <a:blip r:embed="rId31">
+                      <a:extLst>
+                        <a:ext uri="{28A0092B-C50C-407E-A947-70E740481C1C}">
+                          <a14:useLocalDpi xmlns:a14="http://schemas.microsoft.com/office/drawing/2010/main" val="0"/>
+                        </a:ext>
+                      </a:extLst>
+                    </a:blip>
+                    <a:srcRect/>
+                    <a:stretch>
+                      <a:fillRect/>
+                    </a:stretch>
+                  </pic:blipFill>
+                  <pic:spPr bwMode="auto">
+                    <a:xfrm>
+                      <a:off x="0" y="0"/>
+                      <a:ext cx="5943600" cy="2890048"/>
+                    </a:xfrm>
+                    <a:prstGeom prst="rect">
+                      <a:avLst/>
+                    </a:prstGeom>
+                    <a:noFill/>
+                    <a:ln>
+                      <a:noFill/>
+                    </a:ln>
+                  </pic:spPr>
+                </pic:pic>
+              </a:graphicData>
+            </a:graphic>
+          </wp:inline>
+        </w:drawing>
+      </w:r>
+      <w:bookmarkStart w:id="19" w:name="_نتیجه_گیری_:"/>
+      <w:bookmarkStart w:id="20" w:name="_مشخصات_فنی_سامانه"/>
+      <w:bookmarkEnd w:id="19"/>
+      <w:bookmarkEnd w:id="20"/>
+    </w:p>
+    <w:p>
+      <w:pPr>
+        <w:bidi/>
+        <w:rPr>
+          <w:rFonts w:cs="B Nazanin"/>
+          <w:sz w:val="36"/>
+          <w:szCs w:val="36"/>
+          <w:rtl/>
+          <w:lang w:bidi="fa-IR"/>
+        </w:rPr>
+      </w:pPr>
+    </w:p>
+    <w:p>
+      <w:pPr>
+        <w:pStyle w:val="Heading1"/>
+        <w:bidi/>
+        <w:rPr>
+          <w:rFonts w:cs="B Nazanin"/>
+          <w:sz w:val="36"/>
+          <w:szCs w:val="36"/>
+          <w:rtl/>
+          <w:lang w:bidi="fa-IR"/>
+        </w:rPr>
+      </w:pPr>
+      <w:r>
+        <w:rPr>
+          <w:rFonts w:cs="B Nazanin" w:hint="cs"/>
+          <w:sz w:val="36"/>
+          <w:szCs w:val="36"/>
+          <w:rtl/>
+          <w:lang w:bidi="fa-IR"/>
+        </w:rPr>
+        <w:lastRenderedPageBreak/>
         <w:t>مشخصات فنی سامانه :</w:t>
       </w:r>
+      <w:bookmarkStart w:id="21" w:name="_GoBack"/>
+      <w:bookmarkEnd w:id="21"/>
     </w:p>
     <w:p>
       <w:pPr>
@@ -10294,6 +10940,92 @@
     </w:lvl>
   </w:abstractNum>
   <w:abstractNum w:abstractNumId="19" w15:restartNumberingAfterBreak="0">
+    <w:nsid w:val="448564AA"/>
+    <w:multiLevelType w:val="hybridMultilevel"/>
+    <w:tmpl w:val="1E82D07E"/>
+    <w:lvl w:ilvl="0" w:tplc="0409000F">
+      <w:start w:val="1"/>
+      <w:numFmt w:val="decimal"/>
+      <w:lvlText w:val="%1."/>
+      <w:lvlJc w:val="left"/>
+      <w:pPr>
+        <w:ind w:left="720" w:hanging="360"/>
+      </w:pPr>
+    </w:lvl>
+    <w:lvl w:ilvl="1" w:tplc="04090019" w:tentative="1">
+      <w:start w:val="1"/>
+      <w:numFmt w:val="lowerLetter"/>
+      <w:lvlText w:val="%2."/>
+      <w:lvlJc w:val="left"/>
+      <w:pPr>
+        <w:ind w:left="1440" w:hanging="360"/>
+      </w:pPr>
+    </w:lvl>
+    <w:lvl w:ilvl="2" w:tplc="0409001B" w:tentative="1">
+      <w:start w:val="1"/>
+      <w:numFmt w:val="lowerRoman"/>
+      <w:lvlText w:val="%3."/>
+      <w:lvlJc w:val="right"/>
+      <w:pPr>
+        <w:ind w:left="2160" w:hanging="180"/>
+      </w:pPr>
+    </w:lvl>
+    <w:lvl w:ilvl="3" w:tplc="0409000F" w:tentative="1">
+      <w:start w:val="1"/>
+      <w:numFmt w:val="decimal"/>
+      <w:lvlText w:val="%4."/>
+      <w:lvlJc w:val="left"/>
+      <w:pPr>
+        <w:ind w:left="2880" w:hanging="360"/>
+      </w:pPr>
+    </w:lvl>
+    <w:lvl w:ilvl="4" w:tplc="04090019" w:tentative="1">
+      <w:start w:val="1"/>
+      <w:numFmt w:val="lowerLetter"/>
+      <w:lvlText w:val="%5."/>
+      <w:lvlJc w:val="left"/>
+      <w:pPr>
+        <w:ind w:left="3600" w:hanging="360"/>
+      </w:pPr>
+    </w:lvl>
+    <w:lvl w:ilvl="5" w:tplc="0409001B" w:tentative="1">
+      <w:start w:val="1"/>
+      <w:numFmt w:val="lowerRoman"/>
+      <w:lvlText w:val="%6."/>
+      <w:lvlJc w:val="right"/>
+      <w:pPr>
+        <w:ind w:left="4320" w:hanging="180"/>
+      </w:pPr>
+    </w:lvl>
+    <w:lvl w:ilvl="6" w:tplc="0409000F" w:tentative="1">
+      <w:start w:val="1"/>
+      <w:numFmt w:val="decimal"/>
+      <w:lvlText w:val="%7."/>
+      <w:lvlJc w:val="left"/>
+      <w:pPr>
+        <w:ind w:left="5040" w:hanging="360"/>
+      </w:pPr>
+    </w:lvl>
+    <w:lvl w:ilvl="7" w:tplc="04090019" w:tentative="1">
+      <w:start w:val="1"/>
+      <w:numFmt w:val="lowerLetter"/>
+      <w:lvlText w:val="%8."/>
+      <w:lvlJc w:val="left"/>
+      <w:pPr>
+        <w:ind w:left="5760" w:hanging="360"/>
+      </w:pPr>
+    </w:lvl>
+    <w:lvl w:ilvl="8" w:tplc="0409001B" w:tentative="1">
+      <w:start w:val="1"/>
+      <w:numFmt w:val="lowerRoman"/>
+      <w:lvlText w:val="%9."/>
+      <w:lvlJc w:val="right"/>
+      <w:pPr>
+        <w:ind w:left="6480" w:hanging="180"/>
+      </w:pPr>
+    </w:lvl>
+  </w:abstractNum>
+  <w:abstractNum w:abstractNumId="20" w15:restartNumberingAfterBreak="0">
     <w:nsid w:val="45353262"/>
     <w:multiLevelType w:val="hybridMultilevel"/>
     <w:tmpl w:val="16DEC22A"/>
@@ -10406,7 +11138,7 @@
       </w:rPr>
     </w:lvl>
   </w:abstractNum>
-  <w:abstractNum w:abstractNumId="20" w15:restartNumberingAfterBreak="0">
+  <w:abstractNum w:abstractNumId="21" w15:restartNumberingAfterBreak="0">
     <w:nsid w:val="54532EFF"/>
     <w:multiLevelType w:val="hybridMultilevel"/>
     <w:tmpl w:val="333E4562"/>
@@ -10519,7 +11251,7 @@
       </w:rPr>
     </w:lvl>
   </w:abstractNum>
-  <w:abstractNum w:abstractNumId="21" w15:restartNumberingAfterBreak="0">
+  <w:abstractNum w:abstractNumId="22" w15:restartNumberingAfterBreak="0">
     <w:nsid w:val="598923E5"/>
     <w:multiLevelType w:val="hybridMultilevel"/>
     <w:tmpl w:val="95D6CC62"/>
@@ -10632,7 +11364,7 @@
       </w:rPr>
     </w:lvl>
   </w:abstractNum>
-  <w:abstractNum w:abstractNumId="22" w15:restartNumberingAfterBreak="0">
+  <w:abstractNum w:abstractNumId="23" w15:restartNumberingAfterBreak="0">
     <w:nsid w:val="5CB90193"/>
     <w:multiLevelType w:val="hybridMultilevel"/>
     <w:tmpl w:val="3D50A64A"/>
@@ -10718,7 +11450,7 @@
       </w:pPr>
     </w:lvl>
   </w:abstractNum>
-  <w:abstractNum w:abstractNumId="23" w15:restartNumberingAfterBreak="0">
+  <w:abstractNum w:abstractNumId="24" w15:restartNumberingAfterBreak="0">
     <w:nsid w:val="5EC165DE"/>
     <w:multiLevelType w:val="hybridMultilevel"/>
     <w:tmpl w:val="669AB88E"/>
@@ -10804,7 +11536,7 @@
       </w:pPr>
     </w:lvl>
   </w:abstractNum>
-  <w:abstractNum w:abstractNumId="24" w15:restartNumberingAfterBreak="0">
+  <w:abstractNum w:abstractNumId="25" w15:restartNumberingAfterBreak="0">
     <w:nsid w:val="63212908"/>
     <w:multiLevelType w:val="hybridMultilevel"/>
     <w:tmpl w:val="3E5E1910"/>
@@ -10917,7 +11649,7 @@
       </w:rPr>
     </w:lvl>
   </w:abstractNum>
-  <w:abstractNum w:abstractNumId="25" w15:restartNumberingAfterBreak="0">
+  <w:abstractNum w:abstractNumId="26" w15:restartNumberingAfterBreak="0">
     <w:nsid w:val="6AB32CE8"/>
     <w:multiLevelType w:val="hybridMultilevel"/>
     <w:tmpl w:val="E984346A"/>
@@ -11003,7 +11735,7 @@
       </w:pPr>
     </w:lvl>
   </w:abstractNum>
-  <w:abstractNum w:abstractNumId="26" w15:restartNumberingAfterBreak="0">
+  <w:abstractNum w:abstractNumId="27" w15:restartNumberingAfterBreak="0">
     <w:nsid w:val="6E44745B"/>
     <w:multiLevelType w:val="hybridMultilevel"/>
     <w:tmpl w:val="0C628A4E"/>
@@ -11089,7 +11821,7 @@
       </w:pPr>
     </w:lvl>
   </w:abstractNum>
-  <w:abstractNum w:abstractNumId="27" w15:restartNumberingAfterBreak="0">
+  <w:abstractNum w:abstractNumId="28" w15:restartNumberingAfterBreak="0">
     <w:nsid w:val="75ED655F"/>
     <w:multiLevelType w:val="hybridMultilevel"/>
     <w:tmpl w:val="8FD6AFD4"/>
@@ -11202,7 +11934,7 @@
       </w:rPr>
     </w:lvl>
   </w:abstractNum>
-  <w:abstractNum w:abstractNumId="28" w15:restartNumberingAfterBreak="0">
+  <w:abstractNum w:abstractNumId="29" w15:restartNumberingAfterBreak="0">
     <w:nsid w:val="76EA4A71"/>
     <w:multiLevelType w:val="hybridMultilevel"/>
     <w:tmpl w:val="4DAAE1B8"/>
@@ -11292,7 +12024,7 @@
       </w:pPr>
     </w:lvl>
   </w:abstractNum>
-  <w:abstractNum w:abstractNumId="29" w15:restartNumberingAfterBreak="0">
+  <w:abstractNum w:abstractNumId="30" w15:restartNumberingAfterBreak="0">
     <w:nsid w:val="7AE7471C"/>
     <w:multiLevelType w:val="hybridMultilevel"/>
     <w:tmpl w:val="787A4210"/>
@@ -11378,7 +12110,7 @@
       </w:pPr>
     </w:lvl>
   </w:abstractNum>
-  <w:abstractNum w:abstractNumId="30" w15:restartNumberingAfterBreak="0">
+  <w:abstractNum w:abstractNumId="31" w15:restartNumberingAfterBreak="0">
     <w:nsid w:val="7E3A4846"/>
     <w:multiLevelType w:val="hybridMultilevel"/>
     <w:tmpl w:val="C4E896D4"/>
@@ -11464,7 +12196,7 @@
       </w:pPr>
     </w:lvl>
   </w:abstractNum>
-  <w:abstractNum w:abstractNumId="31" w15:restartNumberingAfterBreak="0">
+  <w:abstractNum w:abstractNumId="32" w15:restartNumberingAfterBreak="0">
     <w:nsid w:val="7FBE653F"/>
     <w:multiLevelType w:val="hybridMultilevel"/>
     <w:tmpl w:val="F392D01A"/>
@@ -11587,13 +12319,13 @@
     <w:abstractNumId w:val="12"/>
   </w:num>
   <w:num w:numId="4">
-    <w:abstractNumId w:val="26"/>
+    <w:abstractNumId w:val="27"/>
   </w:num>
   <w:num w:numId="5">
-    <w:abstractNumId w:val="24"/>
+    <w:abstractNumId w:val="25"/>
   </w:num>
   <w:num w:numId="6">
-    <w:abstractNumId w:val="29"/>
+    <w:abstractNumId w:val="30"/>
   </w:num>
   <w:num w:numId="7">
     <w:abstractNumId w:val="2"/>
@@ -11602,10 +12334,10 @@
     <w:abstractNumId w:val="11"/>
   </w:num>
   <w:num w:numId="9">
-    <w:abstractNumId w:val="23"/>
+    <w:abstractNumId w:val="24"/>
   </w:num>
   <w:num w:numId="10">
-    <w:abstractNumId w:val="21"/>
+    <w:abstractNumId w:val="22"/>
   </w:num>
   <w:num w:numId="11">
     <w:abstractNumId w:val="6"/>
@@ -11614,7 +12346,7 @@
     <w:abstractNumId w:val="9"/>
   </w:num>
   <w:num w:numId="13">
-    <w:abstractNumId w:val="27"/>
+    <w:abstractNumId w:val="28"/>
   </w:num>
   <w:num w:numId="14">
     <w:abstractNumId w:val="16"/>
@@ -11623,7 +12355,7 @@
     <w:abstractNumId w:val="14"/>
   </w:num>
   <w:num w:numId="16">
-    <w:abstractNumId w:val="20"/>
+    <w:abstractNumId w:val="21"/>
   </w:num>
   <w:num w:numId="17">
     <w:abstractNumId w:val="7"/>
@@ -11632,7 +12364,7 @@
     <w:abstractNumId w:val="0"/>
   </w:num>
   <w:num w:numId="19">
-    <w:abstractNumId w:val="28"/>
+    <w:abstractNumId w:val="29"/>
   </w:num>
   <w:num w:numId="20">
     <w:abstractNumId w:val="17"/>
@@ -11644,7 +12376,7 @@
     <w:abstractNumId w:val="4"/>
   </w:num>
   <w:num w:numId="23">
-    <w:abstractNumId w:val="31"/>
+    <w:abstractNumId w:val="32"/>
   </w:num>
   <w:num w:numId="24">
     <w:abstractNumId w:val="8"/>
@@ -11659,19 +12391,22 @@
     <w:abstractNumId w:val="5"/>
   </w:num>
   <w:num w:numId="28">
-    <w:abstractNumId w:val="19"/>
+    <w:abstractNumId w:val="20"/>
   </w:num>
   <w:num w:numId="29">
-    <w:abstractNumId w:val="22"/>
+    <w:abstractNumId w:val="23"/>
   </w:num>
   <w:num w:numId="30">
-    <w:abstractNumId w:val="30"/>
+    <w:abstractNumId w:val="31"/>
   </w:num>
   <w:num w:numId="31">
     <w:abstractNumId w:val="15"/>
   </w:num>
   <w:num w:numId="32">
-    <w:abstractNumId w:val="25"/>
+    <w:abstractNumId w:val="26"/>
+  </w:num>
+  <w:num w:numId="33">
+    <w:abstractNumId w:val="19"/>
   </w:num>
 </w:numbering>
 </file>
@@ -12653,7 +13388,7 @@
 </file>
 
 <file path=customXml/itemProps1.xml><?xml version="1.0" encoding="utf-8"?>
-<ds:datastoreItem xmlns:ds="http://schemas.openxmlformats.org/officeDocument/2006/customXml" ds:itemID="{C3213B33-782B-41B5-A381-62CC2A8074B7}">
+<ds:datastoreItem xmlns:ds="http://schemas.openxmlformats.org/officeDocument/2006/customXml" ds:itemID="{3A4DCC32-0874-4098-B609-EC0F2DAF1B75}">
   <ds:schemaRefs>
     <ds:schemaRef ds:uri="http://schemas.openxmlformats.org/officeDocument/2006/bibliography"/>
   </ds:schemaRefs>

</xml_diff>